<commit_message>
Redesign K-3 supplementary materials: TPT-quality visual overhaul
Major visual redesign for kid-friendly, Teachers Pay Teachers quality:
- ALL coloring sheets + fix activities now LANDSCAPE orientation
- K-1: Full-page TPT coloring pages with huge illustrations, Comic Sans MS font,
  minimal text, colorful header/footer banners, "Color My Model!" theme
- G2-3: Picture-driven worksheets with AI scene illustrations, colorful bordered
  sections, 3-column visual fix-the-system layout, 2x2 grid home connections
- Interactive notebooks: Colorful two-tone landscape foldables (blue front/yellow inside)
- Reading passages: Scene illustration headers, Fun Fact highlight boxes, green Think About It sections
- Home connections: 4-section colorful grid (orange/green/yellow/purple)
- 40 new AI images: fix-diagram and scene illustrations for G2-3
- Games upgraded: larger fonts, Comic Sans, more vibrant gradients, bigger touch targets

Co-Authored-By: Claude Opus 4.6 <noreply@anthropic.com>
</commit_message>
<xml_diff>
--- a/materials/grade-01/G01-L01/G01-L01-Coloring-Sheet.docx
+++ b/materials/grade-01/G01-L01/G01-L01-Coloring-Sheet.docx
@@ -2,187 +2,207 @@
 <file path=word/document.xml><?xml version="1.0" encoding="utf-8"?>
 <w:document xmlns:wpc="http://schemas.microsoft.com/office/word/2010/wordprocessingCanvas" xmlns:mo="http://schemas.microsoft.com/office/mac/office/2008/main" xmlns:mc="http://schemas.openxmlformats.org/markup-compatibility/2006" xmlns:mv="urn:schemas-microsoft-com:mac:vml" xmlns:o="urn:schemas-microsoft-com:office:office" xmlns:r="http://schemas.openxmlformats.org/officeDocument/2006/relationships" xmlns:m="http://schemas.openxmlformats.org/officeDocument/2006/math" xmlns:v="urn:schemas-microsoft-com:vml" xmlns:wp14="http://schemas.microsoft.com/office/word/2010/wordprocessingDrawing" xmlns:wp="http://schemas.openxmlformats.org/drawingml/2006/wordprocessingDrawing" xmlns:w10="urn:schemas-microsoft-com:office:word" xmlns:w="http://schemas.openxmlformats.org/wordprocessingml/2006/main" xmlns:w14="http://schemas.microsoft.com/office/word/2010/wordml" xmlns:wpg="http://schemas.microsoft.com/office/word/2010/wordprocessingGroup" xmlns:wpi="http://schemas.microsoft.com/office/word/2010/wordprocessingInk" xmlns:wne="http://schemas.microsoft.com/office/word/2006/wordml" xmlns:wps="http://schemas.microsoft.com/office/word/2010/wordprocessingShape" mc:Ignorable="w14 wp14">
   <w:body>
-    <w:p>
-      <w:pPr>
-        <w:jc w:val="center"/>
-      </w:pPr>
-      <w:r>
-        <w:rPr>
-          <w:b/>
-          <w:color w:val="2E86AB"/>
-          <w:sz w:val="48"/>
-        </w:rPr>
-        <w:t>ModelIt! Coloring Sheet</w:t>
-      </w:r>
-    </w:p>
-    <w:p>
-      <w:pPr>
-        <w:jc w:val="center"/>
-      </w:pPr>
-      <w:r>
-        <w:rPr>
-          <w:b/>
-          <w:color w:val="1A4780"/>
-          <w:sz w:val="36"/>
-        </w:rPr>
-        <w:t>How Does Sound Travel?</w:t>
-      </w:r>
-    </w:p>
-    <w:p>
-      <w:pPr>
-        <w:jc w:val="center"/>
-      </w:pPr>
-      <w:r>
-        <w:rPr>
-          <w:color w:val="666666"/>
-          <w:sz w:val="24"/>
-        </w:rPr>
-        <w:t>1st Grade</w:t>
-      </w:r>
-    </w:p>
     <w:tbl>
       <w:tblPr>
         <w:tblW w:type="auto" w:w="0"/>
+        <w:tblLook w:firstColumn="1" w:firstRow="1" w:lastColumn="0" w:lastRow="0" w:noHBand="0" w:noVBand="1" w:val="04A0"/>
         <w:jc w:val="center"/>
-        <w:tblLook w:firstColumn="1" w:firstRow="1" w:lastColumn="0" w:lastRow="0" w:noHBand="0" w:noVBand="1" w:val="04A0"/>
+        <w:tblBorders>
+          <w:top w:val="none" w:sz="0" w:space="0" w:color="auto"/>
+          <w:left w:val="none" w:sz="0" w:space="0" w:color="auto"/>
+          <w:bottom w:val="none" w:sz="0" w:space="0" w:color="auto"/>
+          <w:right w:val="none" w:sz="0" w:space="0" w:color="auto"/>
+          <w:insideH w:val="none" w:sz="0" w:space="0" w:color="auto"/>
+          <w:insideV w:val="none" w:sz="0" w:space="0" w:color="auto"/>
+        </w:tblBorders>
       </w:tblPr>
       <w:tblGrid>
-        <w:gridCol w:w="5040"/>
-        <w:gridCol w:w="5040"/>
+        <w:gridCol w:w="14688"/>
       </w:tblGrid>
       <w:tr>
+        <w:trPr>
+          <w:trHeight w:val="1584" w:hRule="exact"/>
+        </w:trPr>
         <w:tc>
           <w:tcPr>
-            <w:tcW w:type="dxa" w:w="5040"/>
+            <w:tcW w:type="dxa" w:w="14688"/>
+            <w:shd w:fill="E3F2FD"/>
           </w:tcPr>
+          <w:p/>
           <w:p>
+            <w:pPr>
+              <w:spacing w:after="0"/>
+              <w:jc w:val="center"/>
+            </w:pPr>
             <w:r>
               <w:rPr>
-                <w:sz w:val="32"/>
+                <w:rFonts w:ascii="Comic Sans MS" w:hAnsi="Comic Sans MS"/>
+                <w:b/>
+                <w:color w:val="2E86AB"/>
+                <w:sz w:val="64"/>
               </w:rPr>
-              <w:t>Name: _______________________________</w:t>
+              <w:t>Color My Model!</w:t>
+            </w:r>
+          </w:p>
+          <w:p>
+            <w:pPr>
+              <w:spacing w:after="0"/>
+              <w:jc w:val="center"/>
+            </w:pPr>
+            <w:r>
+              <w:rPr>
+                <w:rFonts w:ascii="Comic Sans MS" w:hAnsi="Comic Sans MS"/>
+                <w:color w:val="444444"/>
+                <w:sz w:val="26"/>
+              </w:rPr>
+              <w:t>How Does Sound Travel?  |  1st Grade</w:t>
+            </w:r>
+          </w:p>
+          <w:p>
+            <w:pPr>
+              <w:spacing w:before="80" w:after="120"/>
+              <w:jc w:val="center"/>
+            </w:pPr>
+            <w:r>
+              <w:rPr>
+                <w:rFonts w:ascii="Comic Sans MS" w:hAnsi="Comic Sans MS"/>
+                <w:sz w:val="24"/>
+              </w:rPr>
+              <w:t>Name: ________________________    Date: ____________</w:t>
             </w:r>
           </w:p>
         </w:tc>
+      </w:tr>
+      <w:tr>
+        <w:trPr>
+          <w:trHeight w:val="7920" w:hRule="exact"/>
+        </w:trPr>
         <w:tc>
           <w:tcPr>
-            <w:tcW w:type="dxa" w:w="5040"/>
+            <w:tcW w:type="dxa" w:w="14688"/>
           </w:tcPr>
+          <w:p/>
           <w:p>
+            <w:pPr>
+              <w:jc w:val="center"/>
+            </w:pPr>
+            <w:r>
+              <w:drawing>
+                <wp:inline xmlns:a="http://schemas.openxmlformats.org/drawingml/2006/main" xmlns:pic="http://schemas.openxmlformats.org/drawingml/2006/picture">
+                  <wp:extent cx="8686800" cy="8686800"/>
+                  <wp:docPr id="1" name="Picture 1"/>
+                  <wp:cNvGraphicFramePr>
+                    <a:graphicFrameLocks noChangeAspect="1"/>
+                  </wp:cNvGraphicFramePr>
+                  <a:graphic>
+                    <a:graphicData uri="http://schemas.openxmlformats.org/drawingml/2006/picture">
+                      <pic:pic>
+                        <pic:nvPicPr>
+                          <pic:cNvPr id="0" name="G01-L01-coloring.png"/>
+                          <pic:cNvPicPr/>
+                        </pic:nvPicPr>
+                        <pic:blipFill>
+                          <a:blip r:embed="rId9"/>
+                          <a:stretch>
+                            <a:fillRect/>
+                          </a:stretch>
+                        </pic:blipFill>
+                        <pic:spPr>
+                          <a:xfrm>
+                            <a:off x="0" y="0"/>
+                            <a:ext cx="8686800" cy="8686800"/>
+                          </a:xfrm>
+                          <a:prstGeom prst="rect"/>
+                        </pic:spPr>
+                      </pic:pic>
+                    </a:graphicData>
+                  </a:graphic>
+                </wp:inline>
+              </w:drawing>
+            </w:r>
+          </w:p>
+        </w:tc>
+      </w:tr>
+      <w:tr>
+        <w:trPr>
+          <w:trHeight w:val="1728" w:hRule="exact"/>
+        </w:trPr>
+        <w:tc>
+          <w:tcPr>
+            <w:tcW w:type="dxa" w:w="14688"/>
+            <w:shd w:fill="FFF9C4"/>
+          </w:tcPr>
+          <w:p/>
+          <w:p>
+            <w:pPr>
+              <w:spacing w:after="40"/>
+              <w:jc w:val="center"/>
+            </w:pPr>
             <w:r>
               <w:rPr>
-                <w:sz w:val="32"/>
+                <w:b/>
+                <w:color w:val="E67E22"/>
+                <w:sz w:val="28"/>
               </w:rPr>
-              <w:t>Date: _______________</w:t>
+              <w:t xml:space="preserve">* </w:t>
+            </w:r>
+            <w:r>
+              <w:rPr>
+                <w:rFonts w:ascii="Comic Sans MS" w:hAnsi="Comic Sans MS"/>
+                <w:sz w:val="24"/>
+              </w:rPr>
+              <w:t>A big drum with wavy sound lines coming out of it, reaching a happy child's ear. The sound waves get smaller as they travel farther from the drum.</w:t>
+            </w:r>
+          </w:p>
+          <w:p>
+            <w:pPr>
+              <w:jc w:val="center"/>
+            </w:pPr>
+            <w:r>
+              <w:rPr>
+                <w:rFonts w:ascii="Comic Sans MS" w:hAnsi="Comic Sans MS"/>
+                <w:b/>
+                <w:sz w:val="22"/>
+              </w:rPr>
+              <w:t xml:space="preserve">Arrow Color Key:  </w:t>
+            </w:r>
+            <w:r>
+              <w:rPr>
+                <w:rFonts w:ascii="Comic Sans MS" w:hAnsi="Comic Sans MS"/>
+                <w:b/>
+                <w:color w:val="27AE60"/>
+                <w:sz w:val="22"/>
+              </w:rPr>
+              <w:t xml:space="preserve">GREEN (+) = Go together   </w:t>
+            </w:r>
+            <w:r>
+              <w:rPr>
+                <w:rFonts w:ascii="Comic Sans MS" w:hAnsi="Comic Sans MS"/>
+                <w:b/>
+                <w:color w:val="E74C3C"/>
+                <w:sz w:val="22"/>
+              </w:rPr>
+              <w:t>RED (-) = Go opposite</w:t>
+            </w:r>
+          </w:p>
+          <w:p>
+            <w:pPr>
+              <w:jc w:val="center"/>
+            </w:pPr>
+            <w:r>
+              <w:rPr>
+                <w:color w:val="999999"/>
+                <w:sz w:val="16"/>
+              </w:rPr>
+              <w:t>ModelIt! G01-L01</w:t>
             </w:r>
           </w:p>
         </w:tc>
       </w:tr>
     </w:tbl>
-    <w:p/>
-    <w:p>
-      <w:pPr>
-        <w:jc w:val="center"/>
-      </w:pPr>
-      <w:r>
-        <w:drawing>
-          <wp:inline xmlns:a="http://schemas.openxmlformats.org/drawingml/2006/main" xmlns:pic="http://schemas.openxmlformats.org/drawingml/2006/picture">
-            <wp:extent cx="5029200" cy="5029200"/>
-            <wp:docPr id="1" name="Picture 1"/>
-            <wp:cNvGraphicFramePr>
-              <a:graphicFrameLocks noChangeAspect="1"/>
-            </wp:cNvGraphicFramePr>
-            <a:graphic>
-              <a:graphicData uri="http://schemas.openxmlformats.org/drawingml/2006/picture">
-                <pic:pic>
-                  <pic:nvPicPr>
-                    <pic:cNvPr id="0" name="G01-L01-coloring.png"/>
-                    <pic:cNvPicPr/>
-                  </pic:nvPicPr>
-                  <pic:blipFill>
-                    <a:blip r:embed="rId9"/>
-                    <a:stretch>
-                      <a:fillRect/>
-                    </a:stretch>
-                  </pic:blipFill>
-                  <pic:spPr>
-                    <a:xfrm>
-                      <a:off x="0" y="0"/>
-                      <a:ext cx="5029200" cy="5029200"/>
-                    </a:xfrm>
-                    <a:prstGeom prst="rect"/>
-                  </pic:spPr>
-                </pic:pic>
-              </a:graphicData>
-            </a:graphic>
-          </wp:inline>
-        </w:drawing>
-      </w:r>
-    </w:p>
-    <w:p/>
-    <w:p>
-      <w:r>
-        <w:rPr>
-          <w:b/>
-          <w:color w:val="1A4780"/>
-          <w:sz w:val="36"/>
-        </w:rPr>
-        <w:t>Color It!</w:t>
-      </w:r>
-    </w:p>
-    <w:p>
-      <w:r>
-        <w:rPr>
-          <w:sz w:val="28"/>
-        </w:rPr>
-        <w:t>A big drum with wavy sound lines coming out of it, reaching a happy child's ear. The sound waves get smaller as they travel farther from the drum.</w:t>
-      </w:r>
-    </w:p>
-    <w:p/>
-    <w:p>
-      <w:r>
-        <w:rPr>
-          <w:b/>
-          <w:color w:val="2E86AB"/>
-          <w:sz w:val="28"/>
-        </w:rPr>
-        <w:t>Arrow Color Key:</w:t>
-      </w:r>
-    </w:p>
-    <w:p>
-      <w:r>
-        <w:rPr>
-          <w:b/>
-          <w:color w:val="27AE60"/>
-          <w:sz w:val="26"/>
-        </w:rPr>
-        <w:t xml:space="preserve">Green arrow (+) = Go together (both go up!)  </w:t>
-      </w:r>
-      <w:r>
-        <w:rPr>
-          <w:b/>
-          <w:color w:val="E74C3C"/>
-          <w:sz w:val="26"/>
-        </w:rPr>
-        <w:t>Red arrow (-) = Go opposite (one up, one down!)</w:t>
-      </w:r>
-    </w:p>
-    <w:p/>
-    <w:p>
-      <w:pPr>
-        <w:jc w:val="center"/>
-      </w:pPr>
-      <w:r>
-        <w:rPr>
-          <w:color w:val="999999"/>
-          <w:sz w:val="16"/>
-        </w:rPr>
-        <w:t>ModelIt! G01-L01</w:t>
-      </w:r>
-    </w:p>
     <w:sectPr>
-      <w:pgSz w:w="12240" w:h="15840"/>
-      <w:pgMar w:top="720" w:right="1080" w:bottom="720" w:left="1080" w:header="720" w:footer="720" w:gutter="0"/>
+      <w:pgSz w:w="15840" w:h="12240" w:orient="landscape"/>
+      <w:pgMar w:top="432" w:right="576" w:bottom="432" w:left="576" w:header="720" w:footer="720" w:gutter="0"/>
       <w:cols w:space="720"/>
       <w:docGrid w:linePitch="360"/>
     </w:sectPr>

</xml_diff>